<commit_message>
Stage 2 minor revisions
- Revise manuscript and supplement in response to reviewer and editor comments
- Record sample flow (1,201 completed; 27 declined data use; 1,174 analyzed) in
  data/smile25b_sample_flow.csv, written by smile25b_process_data.R before
  non-consenting participants are removed
- README: correct participant counts and process_data.R line ranges
</commit_message>
<xml_diff>
--- a/writing/smile25b_SI.docx
+++ b/writing/smile25b_SI.docx
@@ -1256,7 +1256,7 @@
         <w:pStyle w:val="BodyText"/>
       </w:pPr>
       <w:r>
-        <w:t>For facial expression analysis, we initially planned a moderate cutoff: 1.5 / 5.</w:t>
+        <w:t>For facial expression analysis, we planned a moderate cutoff: 1.5 / 5.</w:t>
       </w:r>
       <w:r>
         <w:rPr>
@@ -1521,7 +1521,23 @@
         <w:footnoteRef/>
       </w:r>
       <w:r>
-        <w:t xml:space="preserve"> As a reminder, we switched from Hume AI to OpenFace 2.2.0 because the former deprecated their expression analysis application before we completed our study. Because Hume AI (0-1) and OpenFace (0-5) have different scaling, we adjusted our initial .3/1 cutoff to 1.5/5.</w:t>
+        <w:t xml:space="preserve"> As a reminder, we switched from Hume AI to </w:t>
+      </w:r>
+      <w:proofErr w:type="spellStart"/>
+      <w:r>
+        <w:t>OpenFace</w:t>
+      </w:r>
+      <w:proofErr w:type="spellEnd"/>
+      <w:r>
+        <w:t xml:space="preserve"> 2.2.0 because the former deprecated their expression analysis application before we completed our study. Because Hume AI (0-1) and </w:t>
+      </w:r>
+      <w:proofErr w:type="spellStart"/>
+      <w:r>
+        <w:t>OpenFace</w:t>
+      </w:r>
+      <w:proofErr w:type="spellEnd"/>
+      <w:r>
+        <w:t xml:space="preserve"> (0-5) have different scaling, we adjusted our initial .3/1 cutoff to 1.5/5.</w:t>
       </w:r>
     </w:p>
   </w:footnote>

</xml_diff>